<commit_message>
Regenerate exports, notebooks, and metrics after QA run.
Assignment report PDF/DOCX with embedded figures; manuscript export with
numbered figures; notebooks 01 and 03–06 executed successfully.
</commit_message>
<xml_diff>
--- a/reports/manuscript.docx
+++ b/reports/manuscript.docx
@@ -2,7 +2,7 @@
 <file path=word/document.xml><?xml version="1.0" encoding="utf-8"?>
 <w:document xmlns:w="http://schemas.openxmlformats.org/wordprocessingml/2006/main" xmlns:m="http://schemas.openxmlformats.org/officeDocument/2006/math" xmlns:r="http://schemas.openxmlformats.org/officeDocument/2006/relationships" xmlns:o="urn:schemas-microsoft-com:office:office" xmlns:v="urn:schemas-microsoft-com:vml" xmlns:w10="urn:schemas-microsoft-com:office:word" xmlns:a="http://schemas.openxmlformats.org/drawingml/2006/main" xmlns:pic="http://schemas.openxmlformats.org/drawingml/2006/picture" xmlns:wp="http://schemas.openxmlformats.org/drawingml/2006/wordprocessingDrawing">
   <w:body>
-    <w:bookmarkStart w:id="41" w:name="Xaecccd9943c33c375992119cd60fdae67817fe3"/>
+    <w:bookmarkStart w:id="63" w:name="Xaecccd9943c33c375992119cd60fdae67817fe3"/>
     <w:p>
       <w:pPr>
         <w:pStyle w:val="Heading1"/>
@@ -1195,7 +1195,7 @@
     </w:p>
     <w:bookmarkEnd w:id="17"/>
     <w:bookmarkEnd w:id="18"/>
-    <w:bookmarkStart w:id="29" w:name="results"/>
+    <w:bookmarkStart w:id="53" w:name="results"/>
     <w:p>
       <w:pPr>
         <w:pStyle w:val="Heading2"/>
@@ -1204,7 +1204,90 @@
         <w:t xml:space="preserve">3. Results</w:t>
       </w:r>
     </w:p>
-    <w:bookmarkStart w:id="19" w:name="cohort-and-clinical-prognosis"/>
+    <w:p>
+      <w:pPr>
+        <w:pStyle w:val="CaptionedFigure"/>
+      </w:pPr>
+      <w:r>
+        <w:drawing>
+          <wp:inline>
+            <wp:extent cx="5334000" cy="2140144"/>
+            <wp:effectExtent b="0" l="0" r="0" t="0"/>
+            <wp:docPr descr="Figure 1. Kaplan–Meier overall survival by fractionation scheme and WHO performance status (n=190). Median OS 60 vs 28 weeks (log-rank p≈3×10⁻⁶)." title="" id="20" name="Picture"/>
+            <a:graphic>
+              <a:graphicData uri="http://schemas.openxmlformats.org/drawingml/2006/picture">
+                <pic:pic>
+                  <pic:nvPicPr>
+                    <pic:cNvPr descr="figures/04_clinical_prognosis.png" id="21" name="Picture"/>
+                    <pic:cNvPicPr>
+                      <a:picLocks noChangeArrowheads="1" noChangeAspect="1"/>
+                    </pic:cNvPicPr>
+                  </pic:nvPicPr>
+                  <pic:blipFill>
+                    <a:blip r:embed="rId19"/>
+                    <a:stretch>
+                      <a:fillRect/>
+                    </a:stretch>
+                  </pic:blipFill>
+                  <pic:spPr bwMode="auto">
+                    <a:xfrm>
+                      <a:off x="0" y="0"/>
+                      <a:ext cx="5334000" cy="2140144"/>
+                    </a:xfrm>
+                    <a:prstGeom prst="rect">
+                      <a:avLst/>
+                    </a:prstGeom>
+                    <a:noFill/>
+                    <a:ln w="9525">
+                      <a:noFill/>
+                      <a:headEnd/>
+                      <a:tailEnd/>
+                    </a:ln>
+                  </pic:spPr>
+                </pic:pic>
+              </a:graphicData>
+            </a:graphic>
+          </wp:inline>
+        </w:drawing>
+      </w:r>
+    </w:p>
+    <w:p>
+      <w:pPr>
+        <w:pStyle w:val="ImageCaption"/>
+      </w:pPr>
+      <w:r>
+        <w:rPr>
+          <w:b/>
+          <w:bCs/>
+        </w:rPr>
+        <w:t xml:space="preserve">Figure 1.</w:t>
+      </w:r>
+      <w:r>
+        <w:t xml:space="preserve"> </w:t>
+      </w:r>
+      <w:r>
+        <w:t xml:space="preserve">Kaplan–Meier overall survival by fractionation scheme and WHO performance status (n=190). Median OS 60 vs 28 weeks (log-rank p≈3×10⁻⁶).</w:t>
+      </w:r>
+    </w:p>
+    <w:p>
+      <w:pPr>
+        <w:pStyle w:val="BodyText"/>
+      </w:pPr>
+      <w:r>
+        <w:rPr>
+          <w:b/>
+          <w:bCs/>
+        </w:rPr>
+        <w:t xml:space="preserve">Figure 1.</w:t>
+      </w:r>
+      <w:r>
+        <w:t xml:space="preserve"> </w:t>
+      </w:r>
+      <w:r>
+        <w:t xml:space="preserve">Kaplan–Meier overall survival by fractionation scheme and WHO performance status (n=190). Median OS 60 vs 28 weeks (log-rank p≈3×10⁻⁶).</w:t>
+      </w:r>
+    </w:p>
+    <w:bookmarkStart w:id="22" w:name="cohort-and-clinical-prognosis"/>
     <w:p>
       <w:pPr>
         <w:pStyle w:val="Heading3"/>
@@ -1221,8 +1304,8 @@
         <w:t xml:space="preserve">Median age 70 years; median OS 51 weeks. Sixty Gy patients had longer OS than 40 Gy patients (median 60 vs 28 weeks; log-rank p≈3×10⁻⁶), consistent with prior GBM fractionation studies [2,3,15]. Cox model: scheme HR≈0.54 (p≈0.0007), WHO PS HR≈1.42 (p≈0.001) [14].</w:t>
       </w:r>
     </w:p>
-    <w:bookmarkEnd w:id="19"/>
-    <w:bookmarkStart w:id="20" w:name="pooled-tcp-os-proxy"/>
+    <w:bookmarkEnd w:id="22"/>
+    <w:bookmarkStart w:id="26" w:name="pooled-tcp-os-proxy"/>
     <w:p>
       <w:pPr>
         <w:pStyle w:val="Heading3"/>
@@ -1233,7 +1316,90 @@
     </w:p>
     <w:p>
       <w:pPr>
-        <w:pStyle w:val="FirstParagraph"/>
+        <w:pStyle w:val="CaptionedFigure"/>
+      </w:pPr>
+      <w:r>
+        <w:drawing>
+          <wp:inline>
+            <wp:extent cx="5334000" cy="3429000"/>
+            <wp:effectExtent b="0" l="0" r="0" t="0"/>
+            <wp:docPr descr="Figure 2. Fitted TCP curves (Poisson, logistic, probit, gEUD) for EQD2 vs OS median-split proxy (n=190; AUC≈0.68)." title="" id="24" name="Picture"/>
+            <a:graphic>
+              <a:graphicData uri="http://schemas.openxmlformats.org/drawingml/2006/picture">
+                <pic:pic>
+                  <pic:nvPicPr>
+                    <pic:cNvPr descr="figures/03_tcp_curves_os_proxy.png" id="25" name="Picture"/>
+                    <pic:cNvPicPr>
+                      <a:picLocks noChangeArrowheads="1" noChangeAspect="1"/>
+                    </pic:cNvPicPr>
+                  </pic:nvPicPr>
+                  <pic:blipFill>
+                    <a:blip r:embed="rId23"/>
+                    <a:stretch>
+                      <a:fillRect/>
+                    </a:stretch>
+                  </pic:blipFill>
+                  <pic:spPr bwMode="auto">
+                    <a:xfrm>
+                      <a:off x="0" y="0"/>
+                      <a:ext cx="5334000" cy="3429000"/>
+                    </a:xfrm>
+                    <a:prstGeom prst="rect">
+                      <a:avLst/>
+                    </a:prstGeom>
+                    <a:noFill/>
+                    <a:ln w="9525">
+                      <a:noFill/>
+                      <a:headEnd/>
+                      <a:tailEnd/>
+                    </a:ln>
+                  </pic:spPr>
+                </pic:pic>
+              </a:graphicData>
+            </a:graphic>
+          </wp:inline>
+        </w:drawing>
+      </w:r>
+    </w:p>
+    <w:p>
+      <w:pPr>
+        <w:pStyle w:val="ImageCaption"/>
+      </w:pPr>
+      <w:r>
+        <w:rPr>
+          <w:b/>
+          <w:bCs/>
+        </w:rPr>
+        <w:t xml:space="preserve">Figure 2.</w:t>
+      </w:r>
+      <w:r>
+        <w:t xml:space="preserve"> </w:t>
+      </w:r>
+      <w:r>
+        <w:t xml:space="preserve">Fitted TCP curves (Poisson, logistic, probit, gEUD) for EQD2 vs OS median-split proxy (n=190; AUC≈0.68).</w:t>
+      </w:r>
+    </w:p>
+    <w:p>
+      <w:pPr>
+        <w:pStyle w:val="BodyText"/>
+      </w:pPr>
+      <w:r>
+        <w:rPr>
+          <w:b/>
+          <w:bCs/>
+        </w:rPr>
+        <w:t xml:space="preserve">Figure 2.</w:t>
+      </w:r>
+      <w:r>
+        <w:t xml:space="preserve"> </w:t>
+      </w:r>
+      <w:r>
+        <w:t xml:space="preserve">Fitted TCP curves (Poisson, logistic, probit, gEUD) for EQD2 vs OS median-split proxy (n=190; AUC≈0.68).</w:t>
+      </w:r>
+    </w:p>
+    <w:p>
+      <w:pPr>
+        <w:pStyle w:val="BodyText"/>
       </w:pPr>
       <w:r>
         <w:t xml:space="preserve">Poisson/Logistic/Probit TCP on EQD2 achieved in-sample ROC AUC≈0.68 (5-fold CV≈0.68±0.09), significantly better than null (LR p≈3×10⁻⁶). Bootstrap Poisson:</w:t>
@@ -1295,8 +1461,8 @@
         <w:t xml:space="preserve">association is driven largely by fractionation scheme confounding (r(age, EQD2)=−0.57) [7,15].</w:t>
       </w:r>
     </w:p>
-    <w:bookmarkEnd w:id="20"/>
-    <w:bookmarkStart w:id="21" w:name="rano-endpoint-pooled"/>
+    <w:bookmarkEnd w:id="26"/>
+    <w:bookmarkStart w:id="30" w:name="rano-endpoint-pooled"/>
     <w:p>
       <w:pPr>
         <w:pStyle w:val="Heading3"/>
@@ -1307,7 +1473,90 @@
     </w:p>
     <w:p>
       <w:pPr>
-        <w:pStyle w:val="FirstParagraph"/>
+        <w:pStyle w:val="CaptionedFigure"/>
+      </w:pPr>
+      <w:r>
+        <w:drawing>
+          <wp:inline>
+            <wp:extent cx="5334000" cy="3391066"/>
+            <wp:effectExtent b="0" l="0" r="0" t="0"/>
+            <wp:docPr descr="Figure 3. Poisson TCP AUC: OS proxy vs RANO non-PD on the same 137 patients (AUC≈0.62 vs 0.43)." title="" id="28" name="Picture"/>
+            <a:graphic>
+              <a:graphicData uri="http://schemas.openxmlformats.org/drawingml/2006/picture">
+                <pic:pic>
+                  <pic:nvPicPr>
+                    <pic:cNvPr descr="figures/05_rano_vs_os_tcp_auc.png" id="29" name="Picture"/>
+                    <pic:cNvPicPr>
+                      <a:picLocks noChangeArrowheads="1" noChangeAspect="1"/>
+                    </pic:cNvPicPr>
+                  </pic:nvPicPr>
+                  <pic:blipFill>
+                    <a:blip r:embed="rId27"/>
+                    <a:stretch>
+                      <a:fillRect/>
+                    </a:stretch>
+                  </pic:blipFill>
+                  <pic:spPr bwMode="auto">
+                    <a:xfrm>
+                      <a:off x="0" y="0"/>
+                      <a:ext cx="5334000" cy="3391066"/>
+                    </a:xfrm>
+                    <a:prstGeom prst="rect">
+                      <a:avLst/>
+                    </a:prstGeom>
+                    <a:noFill/>
+                    <a:ln w="9525">
+                      <a:noFill/>
+                      <a:headEnd/>
+                      <a:tailEnd/>
+                    </a:ln>
+                  </pic:spPr>
+                </pic:pic>
+              </a:graphicData>
+            </a:graphic>
+          </wp:inline>
+        </w:drawing>
+      </w:r>
+    </w:p>
+    <w:p>
+      <w:pPr>
+        <w:pStyle w:val="ImageCaption"/>
+      </w:pPr>
+      <w:r>
+        <w:rPr>
+          <w:b/>
+          <w:bCs/>
+        </w:rPr>
+        <w:t xml:space="preserve">Figure 3.</w:t>
+      </w:r>
+      <w:r>
+        <w:t xml:space="preserve"> </w:t>
+      </w:r>
+      <w:r>
+        <w:t xml:space="preserve">Poisson TCP AUC: OS proxy vs RANO non-PD on the same 137 patients (AUC≈0.62 vs 0.43).</w:t>
+      </w:r>
+    </w:p>
+    <w:p>
+      <w:pPr>
+        <w:pStyle w:val="BodyText"/>
+      </w:pPr>
+      <w:r>
+        <w:rPr>
+          <w:b/>
+          <w:bCs/>
+        </w:rPr>
+        <w:t xml:space="preserve">Figure 3.</w:t>
+      </w:r>
+      <w:r>
+        <w:t xml:space="preserve"> </w:t>
+      </w:r>
+      <w:r>
+        <w:t xml:space="preserve">Poisson TCP AUC: OS proxy vs RANO non-PD on the same 137 patients (AUC≈0.62 vs 0.43).</w:t>
+      </w:r>
+    </w:p>
+    <w:p>
+      <w:pPr>
+        <w:pStyle w:val="BodyText"/>
       </w:pPr>
       <w:r>
         <w:t xml:space="preserve">On the same 137 patients, pooled EQD2→RANO non-PD yielded AUC≈0.43 (LR p=1.0): higher EQD2 correlated with</w:t>
@@ -1329,8 +1578,8 @@
         <w:t xml:space="preserve">early PD at t1 (60 Gy PD rate 27% vs 40 Gy 15%) [12,15].</w:t>
       </w:r>
     </w:p>
-    <w:bookmarkEnd w:id="21"/>
-    <w:bookmarkStart w:id="22" w:name="within-arm-analysis"/>
+    <w:bookmarkEnd w:id="30"/>
+    <w:bookmarkStart w:id="34" w:name="within-arm-analysis"/>
     <w:p>
       <w:pPr>
         <w:pStyle w:val="Heading3"/>
@@ -1341,57 +1590,730 @@
     </w:p>
     <w:p>
       <w:pPr>
+        <w:pStyle w:val="CaptionedFigure"/>
+      </w:pPr>
+      <w:r>
+        <w:drawing>
+          <wp:inline>
+            <wp:extent cx="5334000" cy="2962077"/>
+            <wp:effectExtent b="0" l="0" r="0" t="0"/>
+            <wp:docPr descr="Figure 4. Within-arm DVH metrics → RANO: dose flat within protocol; GTV volume significant in 40 Gy arm (n=34)." title="" id="32" name="Picture"/>
+            <a:graphic>
+              <a:graphicData uri="http://schemas.openxmlformats.org/drawingml/2006/picture">
+                <pic:pic>
+                  <pic:nvPicPr>
+                    <pic:cNvPr descr="figures/06_within_arm_rano_tcp.png" id="33" name="Picture"/>
+                    <pic:cNvPicPr>
+                      <a:picLocks noChangeArrowheads="1" noChangeAspect="1"/>
+                    </pic:cNvPicPr>
+                  </pic:nvPicPr>
+                  <pic:blipFill>
+                    <a:blip r:embed="rId31"/>
+                    <a:stretch>
+                      <a:fillRect/>
+                    </a:stretch>
+                  </pic:blipFill>
+                  <pic:spPr bwMode="auto">
+                    <a:xfrm>
+                      <a:off x="0" y="0"/>
+                      <a:ext cx="5334000" cy="2962077"/>
+                    </a:xfrm>
+                    <a:prstGeom prst="rect">
+                      <a:avLst/>
+                    </a:prstGeom>
+                    <a:noFill/>
+                    <a:ln w="9525">
+                      <a:noFill/>
+                      <a:headEnd/>
+                      <a:tailEnd/>
+                    </a:ln>
+                  </pic:spPr>
+                </pic:pic>
+              </a:graphicData>
+            </a:graphic>
+          </wp:inline>
+        </w:drawing>
+      </w:r>
+    </w:p>
+    <w:p>
+      <w:pPr>
+        <w:pStyle w:val="ImageCaption"/>
+      </w:pPr>
+      <w:r>
+        <w:rPr>
+          <w:b/>
+          <w:bCs/>
+        </w:rPr>
+        <w:t xml:space="preserve">Figure 4.</w:t>
+      </w:r>
+      <w:r>
+        <w:t xml:space="preserve"> </w:t>
+      </w:r>
+      <w:r>
+        <w:t xml:space="preserve">Within-arm DVH metrics → RANO: dose flat within protocol; GTV volume significant in 40 Gy arm (n=34).</w:t>
+      </w:r>
+    </w:p>
+    <w:p>
+      <w:pPr>
+        <w:pStyle w:val="BodyText"/>
+      </w:pPr>
+      <w:r>
+        <w:rPr>
+          <w:b/>
+          <w:bCs/>
+        </w:rPr>
+        <w:t xml:space="preserve">Figure 4.</w:t>
+      </w:r>
+      <w:r>
+        <w:t xml:space="preserve"> </w:t>
+      </w:r>
+      <w:r>
+        <w:t xml:space="preserve">Within-arm DVH metrics → RANO: dose flat within protocol; GTV volume significant in 40 Gy arm (n=34).</w:t>
+      </w:r>
+    </w:p>
+    <w:p>
+      <w:pPr>
+        <w:pStyle w:val="BodyText"/>
+      </w:pPr>
+      <w:r>
+        <w:t xml:space="preserve">Within 60 Gy, GTV Dmean SD=0.28 Gy — insufficient for dose–response [7].</w:t>
+      </w:r>
+      <w:r>
+        <w:t xml:space="preserve"> </w:t>
+      </w:r>
+      <w:r>
+        <w:rPr>
+          <w:b/>
+          <w:bCs/>
+        </w:rPr>
+        <w:t xml:space="preserve">40 Gy arm (n=34 with RANO):</w:t>
+      </w:r>
+      <w:r>
+        <w:t xml:space="preserve"> </w:t>
+      </w:r>
+      <w:r>
+        <w:t xml:space="preserve">GTV volume predicted RANO non-PD (Poisson TCP AUC=0.83, LR p=0.037; Spearman p=0.016), consistent with tumour burden prognostic literature [16]. Multivariable logistic (volume + age + WHO PS):</w:t>
+      </w:r>
+      <w:r>
+        <w:t xml:space="preserve"> </w:t>
+      </w:r>
+      <w:r>
+        <w:rPr>
+          <w:b/>
+          <w:bCs/>
+        </w:rPr>
+        <w:t xml:space="preserve">AUC=0.90</w:t>
+      </w:r>
+      <w:r>
+        <w:t xml:space="preserve">, bootstrap 95% CI [0.81, 1.00] [18].</w:t>
+      </w:r>
+    </w:p>
+    <w:bookmarkEnd w:id="34"/>
+    <w:bookmarkStart w:id="38" w:name="volume-validation"/>
+    <w:p>
+      <w:pPr>
+        <w:pStyle w:val="Heading3"/>
+      </w:pPr>
+      <w:r>
+        <w:t xml:space="preserve">3.5 Volume validation</w:t>
+      </w:r>
+    </w:p>
+    <w:p>
+      <w:pPr>
+        <w:pStyle w:val="CaptionedFigure"/>
+      </w:pPr>
+      <w:r>
+        <w:drawing>
+          <wp:inline>
+            <wp:extent cx="4923692" cy="4458846"/>
+            <wp:effectExtent b="0" l="0" r="0" t="0"/>
+            <wp:docPr descr="Figure 6. DVH GTV volume vs author RANO size_t0_cm3 (Spearman ρ=1.00, n=141)." title="" id="36" name="Picture"/>
+            <a:graphic>
+              <a:graphicData uri="http://schemas.openxmlformats.org/drawingml/2006/picture">
+                <pic:pic>
+                  <pic:nvPicPr>
+                    <pic:cNvPr descr="figures/07_rano_volume_validation_40gy.png" id="37" name="Picture"/>
+                    <pic:cNvPicPr>
+                      <a:picLocks noChangeArrowheads="1" noChangeAspect="1"/>
+                    </pic:cNvPicPr>
+                  </pic:nvPicPr>
+                  <pic:blipFill>
+                    <a:blip r:embed="rId35"/>
+                    <a:stretch>
+                      <a:fillRect/>
+                    </a:stretch>
+                  </pic:blipFill>
+                  <pic:spPr bwMode="auto">
+                    <a:xfrm>
+                      <a:off x="0" y="0"/>
+                      <a:ext cx="4923692" cy="4458846"/>
+                    </a:xfrm>
+                    <a:prstGeom prst="rect">
+                      <a:avLst/>
+                    </a:prstGeom>
+                    <a:noFill/>
+                    <a:ln w="9525">
+                      <a:noFill/>
+                      <a:headEnd/>
+                      <a:tailEnd/>
+                    </a:ln>
+                  </pic:spPr>
+                </pic:pic>
+              </a:graphicData>
+            </a:graphic>
+          </wp:inline>
+        </w:drawing>
+      </w:r>
+    </w:p>
+    <w:p>
+      <w:pPr>
+        <w:pStyle w:val="ImageCaption"/>
+      </w:pPr>
+      <w:r>
+        <w:rPr>
+          <w:b/>
+          <w:bCs/>
+        </w:rPr>
+        <w:t xml:space="preserve">Figure 6.</w:t>
+      </w:r>
+      <w:r>
+        <w:t xml:space="preserve"> </w:t>
+      </w:r>
+      <w:r>
+        <w:t xml:space="preserve">DVH GTV volume vs author RANO</w:t>
+      </w:r>
+      <w:r>
+        <w:t xml:space="preserve"> </w:t>
+      </w:r>
+      <w:r>
+        <w:rPr>
+          <w:rStyle w:val="VerbatimChar"/>
+        </w:rPr>
+        <w:t xml:space="preserve">size_t0_cm3</w:t>
+      </w:r>
+      <w:r>
+        <w:t xml:space="preserve"> </w:t>
+      </w:r>
+      <w:r>
+        <w:t xml:space="preserve">(Spearman ρ=1.00, n=141).</w:t>
+      </w:r>
+    </w:p>
+    <w:p>
+      <w:pPr>
+        <w:pStyle w:val="BodyText"/>
+      </w:pPr>
+      <w:r>
+        <w:rPr>
+          <w:b/>
+          <w:bCs/>
+        </w:rPr>
+        <w:t xml:space="preserve">Figure 6.</w:t>
+      </w:r>
+      <w:r>
+        <w:t xml:space="preserve"> </w:t>
+      </w:r>
+      <w:r>
+        <w:t xml:space="preserve">DVH GTV volume vs author RANO</w:t>
+      </w:r>
+      <w:r>
+        <w:t xml:space="preserve"> </w:t>
+      </w:r>
+      <w:r>
+        <w:rPr>
+          <w:rStyle w:val="VerbatimChar"/>
+        </w:rPr>
+        <w:t xml:space="preserve">size_t0_cm3</w:t>
+      </w:r>
+      <w:r>
+        <w:t xml:space="preserve"> </w:t>
+      </w:r>
+      <w:r>
+        <w:t xml:space="preserve">(Spearman ρ=1.00, n=141).</w:t>
+      </w:r>
+    </w:p>
+    <w:p>
+      <w:pPr>
+        <w:pStyle w:val="BodyText"/>
+      </w:pPr>
+      <w:r>
+        <w:t xml:space="preserve">DVH GTV volume at t0 agreed with RANO</w:t>
+      </w:r>
+      <w:r>
+        <w:t xml:space="preserve"> </w:t>
+      </w:r>
+      <w:r>
+        <w:rPr>
+          <w:rStyle w:val="VerbatimChar"/>
+        </w:rPr>
+        <w:t xml:space="preserve">size_t0_cm3</w:t>
+      </w:r>
+      <w:r>
+        <w:t xml:space="preserve"> </w:t>
+      </w:r>
+      <w:r>
+        <w:t xml:space="preserve">(Spearman ρ=1.00, n=141) [8]. t1 NIfTI mask validation was not performed locally; analyses used author-reported RANO volumes from the v3 TSV [8,9].</w:t>
+      </w:r>
+    </w:p>
+    <w:bookmarkEnd w:id="38"/>
+    <w:bookmarkStart w:id="39" w:name="rano-and-overall-survival"/>
+    <w:p>
+      <w:pPr>
+        <w:pStyle w:val="Heading3"/>
+      </w:pPr>
+      <w:r>
+        <w:t xml:space="preserve">3.6 RANO and overall survival</w:t>
+      </w:r>
+    </w:p>
+    <w:p>
+      <w:pPr>
         <w:pStyle w:val="FirstParagraph"/>
       </w:pPr>
       <w:r>
-        <w:t xml:space="preserve">Within 60 Gy, GTV Dmean SD=0.28 Gy — insufficient for dose–response [7].</w:t>
-      </w:r>
-      <w:r>
-        <w:t xml:space="preserve"> </w:t>
-      </w:r>
-      <w:r>
-        <w:rPr>
-          <w:b/>
-          <w:bCs/>
-        </w:rPr>
-        <w:t xml:space="preserve">40 Gy arm (n=34 with RANO):</w:t>
-      </w:r>
-      <w:r>
-        <w:t xml:space="preserve"> </w:t>
-      </w:r>
-      <w:r>
-        <w:t xml:space="preserve">GTV volume predicted RANO non-PD (Poisson TCP AUC=0.83, LR p=0.037; Spearman p=0.016), consistent with tumour burden prognostic literature [16]. Multivariable logistic (volume + age + WHO PS):</w:t>
-      </w:r>
-      <w:r>
-        <w:t xml:space="preserve"> </w:t>
-      </w:r>
-      <w:r>
-        <w:rPr>
-          <w:b/>
-          <w:bCs/>
-        </w:rPr>
-        <w:t xml:space="preserve">AUC=0.90</w:t>
-      </w:r>
-      <w:r>
-        <w:t xml:space="preserve">, bootstrap 95% CI [0.81, 1.00] [18].</w:t>
-      </w:r>
-    </w:p>
-    <w:bookmarkEnd w:id="22"/>
-    <w:bookmarkStart w:id="23" w:name="volume-validation"/>
+        <w:t xml:space="preserve">Cox model (n=137): RANO non-PD HR≈0.48 (p≈0.0009); EQD2 remained significant after adjustment (HR≈0.97, p≈0.009) [12,14].</w:t>
+      </w:r>
+    </w:p>
+    <w:bookmarkEnd w:id="39"/>
+    <w:bookmarkStart w:id="43" w:name="Xc8d476549152ed48c2fe29dd7b2e8a44632433d"/>
     <w:p>
       <w:pPr>
         <w:pStyle w:val="Heading3"/>
       </w:pPr>
       <w:r>
-        <w:t xml:space="preserve">3.5 Volume validation</w:t>
-      </w:r>
-    </w:p>
-    <w:p>
-      <w:pPr>
-        <w:pStyle w:val="FirstParagraph"/>
-      </w:pPr>
-      <w:r>
-        <w:t xml:space="preserve">DVH GTV volume at t0 agreed with RANO</w:t>
+        <w:t xml:space="preserve">3.7 Pooled RANO models (volume + clinical + scheme)</w:t>
+      </w:r>
+    </w:p>
+    <w:p>
+      <w:pPr>
+        <w:pStyle w:val="CaptionedFigure"/>
+      </w:pPr>
+      <w:r>
+        <w:drawing>
+          <wp:inline>
+            <wp:extent cx="5334000" cy="4498991"/>
+            <wp:effectExtent b="0" l="0" r="0" t="0"/>
+            <wp:docPr descr="Figure 7. Pooled logistic ROC for RANO non-PD (volume + clinical + scheme; AUC≈0.72; LOOCV≈0.64)." title="" id="41" name="Picture"/>
+            <a:graphic>
+              <a:graphicData uri="http://schemas.openxmlformats.org/drawingml/2006/picture">
+                <pic:pic>
+                  <pic:nvPicPr>
+                    <pic:cNvPr descr="figures/08_pooled_rano_roc.png" id="42" name="Picture"/>
+                    <pic:cNvPicPr>
+                      <a:picLocks noChangeArrowheads="1" noChangeAspect="1"/>
+                    </pic:cNvPicPr>
+                  </pic:nvPicPr>
+                  <pic:blipFill>
+                    <a:blip r:embed="rId40"/>
+                    <a:stretch>
+                      <a:fillRect/>
+                    </a:stretch>
+                  </pic:blipFill>
+                  <pic:spPr bwMode="auto">
+                    <a:xfrm>
+                      <a:off x="0" y="0"/>
+                      <a:ext cx="5334000" cy="4498991"/>
+                    </a:xfrm>
+                    <a:prstGeom prst="rect">
+                      <a:avLst/>
+                    </a:prstGeom>
+                    <a:noFill/>
+                    <a:ln w="9525">
+                      <a:noFill/>
+                      <a:headEnd/>
+                      <a:tailEnd/>
+                    </a:ln>
+                  </pic:spPr>
+                </pic:pic>
+              </a:graphicData>
+            </a:graphic>
+          </wp:inline>
+        </w:drawing>
+      </w:r>
+    </w:p>
+    <w:p>
+      <w:pPr>
+        <w:pStyle w:val="ImageCaption"/>
+      </w:pPr>
+      <w:r>
+        <w:rPr>
+          <w:b/>
+          <w:bCs/>
+        </w:rPr>
+        <w:t xml:space="preserve">Figure 7.</w:t>
+      </w:r>
+      <w:r>
+        <w:t xml:space="preserve"> </w:t>
+      </w:r>
+      <w:r>
+        <w:t xml:space="preserve">Pooled logistic ROC for RANO non-PD (volume + clinical + scheme; AUC≈0.72; LOOCV≈0.64).</w:t>
+      </w:r>
+    </w:p>
+    <w:p>
+      <w:pPr>
+        <w:pStyle w:val="BodyText"/>
+      </w:pPr>
+      <w:r>
+        <w:rPr>
+          <w:b/>
+          <w:bCs/>
+        </w:rPr>
+        <w:t xml:space="preserve">Figure 7.</w:t>
+      </w:r>
+      <w:r>
+        <w:t xml:space="preserve"> </w:t>
+      </w:r>
+      <w:r>
+        <w:t xml:space="preserve">Pooled logistic ROC for RANO non-PD (volume + clinical + scheme; AUC≈0.72; LOOCV≈0.64).</w:t>
+      </w:r>
+    </w:p>
+    <w:p>
+      <w:pPr>
+        <w:pStyle w:val="BodyText"/>
+      </w:pPr>
+      <w:r>
+        <w:t xml:space="preserve">On n=137 with RANO labels, EQD2 alone achieved AUC≈0.57.</w:t>
+      </w:r>
+      <w:r>
+        <w:t xml:space="preserve"> </w:t>
+      </w:r>
+      <w:r>
+        <w:rPr>
+          <w:b/>
+          <w:bCs/>
+        </w:rPr>
+        <w:t xml:space="preserve">GTV volume + age + WHO PS + scheme</w:t>
+      </w:r>
+      <w:r>
+        <w:t xml:space="preserve"> </w:t>
+      </w:r>
+      <w:r>
+        <w:t xml:space="preserve">improved discrimination to</w:t>
+      </w:r>
+      <w:r>
+        <w:t xml:space="preserve"> </w:t>
+      </w:r>
+      <w:r>
+        <w:rPr>
+          <w:b/>
+          <w:bCs/>
+        </w:rPr>
+        <w:t xml:space="preserve">AUC≈0.72</w:t>
+      </w:r>
+      <w:r>
+        <w:t xml:space="preserve">; adding a volume×scheme interaction yielded AUC≈0.72. LOOCV AUC for the pooled clinical model was</w:t>
+      </w:r>
+      <w:r>
+        <w:t xml:space="preserve"> </w:t>
+      </w:r>
+      <w:r>
+        <w:rPr>
+          <w:b/>
+          <w:bCs/>
+        </w:rPr>
+        <w:t xml:space="preserve">≈0.64</w:t>
+      </w:r>
+      <w:r>
+        <w:t xml:space="preserve"> </w:t>
+      </w:r>
+      <w:r>
+        <w:t xml:space="preserve">[18], indicating moderate generalisation within this single-centre cohort.</w:t>
+      </w:r>
+    </w:p>
+    <w:bookmarkEnd w:id="43"/>
+    <w:bookmarkStart w:id="47" w:name="loocv-in-the-hypofractionated-arm"/>
+    <w:p>
+      <w:pPr>
+        <w:pStyle w:val="Heading3"/>
+      </w:pPr>
+      <w:r>
+        <w:t xml:space="preserve">3.8 LOOCV in the hypofractionated arm</w:t>
+      </w:r>
+    </w:p>
+    <w:p>
+      <w:pPr>
+        <w:pStyle w:val="CaptionedFigure"/>
+      </w:pPr>
+      <w:r>
+        <w:drawing>
+          <wp:inline>
+            <wp:extent cx="4428264" cy="4458846"/>
+            <wp:effectExtent b="0" l="0" r="0" t="0"/>
+            <wp:docPr descr="Figure 5. Multivariable logistic ROC for RANO non-PD in 40 Gy arm (in-sample AUC=0.90; LOOCV 0.74)." title="" id="45" name="Picture"/>
+            <a:graphic>
+              <a:graphicData uri="http://schemas.openxmlformats.org/drawingml/2006/picture">
+                <pic:pic>
+                  <pic:nvPicPr>
+                    <pic:cNvPr descr="figures/07_rano_logistic_roc_40gy.png" id="46" name="Picture"/>
+                    <pic:cNvPicPr>
+                      <a:picLocks noChangeArrowheads="1" noChangeAspect="1"/>
+                    </pic:cNvPicPr>
+                  </pic:nvPicPr>
+                  <pic:blipFill>
+                    <a:blip r:embed="rId44"/>
+                    <a:stretch>
+                      <a:fillRect/>
+                    </a:stretch>
+                  </pic:blipFill>
+                  <pic:spPr bwMode="auto">
+                    <a:xfrm>
+                      <a:off x="0" y="0"/>
+                      <a:ext cx="4428264" cy="4458846"/>
+                    </a:xfrm>
+                    <a:prstGeom prst="rect">
+                      <a:avLst/>
+                    </a:prstGeom>
+                    <a:noFill/>
+                    <a:ln w="9525">
+                      <a:noFill/>
+                      <a:headEnd/>
+                      <a:tailEnd/>
+                    </a:ln>
+                  </pic:spPr>
+                </pic:pic>
+              </a:graphicData>
+            </a:graphic>
+          </wp:inline>
+        </w:drawing>
+      </w:r>
+    </w:p>
+    <w:p>
+      <w:pPr>
+        <w:pStyle w:val="ImageCaption"/>
+      </w:pPr>
+      <w:r>
+        <w:rPr>
+          <w:b/>
+          <w:bCs/>
+        </w:rPr>
+        <w:t xml:space="preserve">Figure 5.</w:t>
+      </w:r>
+      <w:r>
+        <w:t xml:space="preserve"> </w:t>
+      </w:r>
+      <w:r>
+        <w:t xml:space="preserve">Multivariable logistic ROC for RANO non-PD in 40 Gy arm (in-sample AUC=0.90; LOOCV 0.74).</w:t>
+      </w:r>
+    </w:p>
+    <w:p>
+      <w:pPr>
+        <w:pStyle w:val="BodyText"/>
+      </w:pPr>
+      <w:r>
+        <w:rPr>
+          <w:b/>
+          <w:bCs/>
+        </w:rPr>
+        <w:t xml:space="preserve">Figure 5.</w:t>
+      </w:r>
+      <w:r>
+        <w:t xml:space="preserve"> </w:t>
+      </w:r>
+      <w:r>
+        <w:t xml:space="preserve">Multivariable logistic ROC for RANO non-PD in 40 Gy arm (in-sample AUC=0.90; LOOCV 0.74).</w:t>
+      </w:r>
+    </w:p>
+    <w:p>
+      <w:pPr>
+        <w:pStyle w:val="BodyText"/>
+      </w:pPr>
+      <w:r>
+        <w:t xml:space="preserve">In-sample multivariable AUC in the 40 Gy arm was 0.90, but</w:t>
+      </w:r>
+      <w:r>
+        <w:t xml:space="preserve"> </w:t>
+      </w:r>
+      <w:r>
+        <w:rPr>
+          <w:b/>
+          <w:bCs/>
+        </w:rPr>
+        <w:t xml:space="preserve">LOOCV AUC was 0.74</w:t>
+      </w:r>
+      <w:r>
+        <w:t xml:space="preserve"> </w:t>
+      </w:r>
+      <w:r>
+        <w:t xml:space="preserve">(volume only) and 0.70 (volume + age + PS) [18], confirming signal beyond chance while reducing optimism bias relative to resubstitution [7].</w:t>
+      </w:r>
+    </w:p>
+    <w:bookmarkEnd w:id="47"/>
+    <w:bookmarkStart w:id="51" w:name="pyradiomics-vs-dvh-volume"/>
+    <w:p>
+      <w:pPr>
+        <w:pStyle w:val="Heading3"/>
+      </w:pPr>
+      <w:r>
+        <w:t xml:space="preserve">3.9 PyRadiomics vs DVH volume</w:t>
+      </w:r>
+    </w:p>
+    <w:p>
+      <w:pPr>
+        <w:pStyle w:val="CaptionedFigure"/>
+      </w:pPr>
+      <w:r>
+        <w:drawing>
+          <wp:inline>
+            <wp:extent cx="5334000" cy="2959567"/>
+            <wp:effectExtent b="0" l="0" r="0" t="0"/>
+            <wp:docPr descr="Figure 8. PyRadiomics top-5 vs DVH volume for RANO (in-sample AUC 0.78 vs 0.71)." title="" id="49" name="Picture"/>
+            <a:graphic>
+              <a:graphicData uri="http://schemas.openxmlformats.org/drawingml/2006/picture">
+                <pic:pic>
+                  <pic:nvPicPr>
+                    <pic:cNvPr descr="figures/08_pyradiomics_vs_volume_auc.png" id="50" name="Picture"/>
+                    <pic:cNvPicPr>
+                      <a:picLocks noChangeArrowheads="1" noChangeAspect="1"/>
+                    </pic:cNvPicPr>
+                  </pic:nvPicPr>
+                  <pic:blipFill>
+                    <a:blip r:embed="rId48"/>
+                    <a:stretch>
+                      <a:fillRect/>
+                    </a:stretch>
+                  </pic:blipFill>
+                  <pic:spPr bwMode="auto">
+                    <a:xfrm>
+                      <a:off x="0" y="0"/>
+                      <a:ext cx="5334000" cy="2959567"/>
+                    </a:xfrm>
+                    <a:prstGeom prst="rect">
+                      <a:avLst/>
+                    </a:prstGeom>
+                    <a:noFill/>
+                    <a:ln w="9525">
+                      <a:noFill/>
+                      <a:headEnd/>
+                      <a:tailEnd/>
+                    </a:ln>
+                  </pic:spPr>
+                </pic:pic>
+              </a:graphicData>
+            </a:graphic>
+          </wp:inline>
+        </w:drawing>
+      </w:r>
+    </w:p>
+    <w:p>
+      <w:pPr>
+        <w:pStyle w:val="ImageCaption"/>
+      </w:pPr>
+      <w:r>
+        <w:rPr>
+          <w:b/>
+          <w:bCs/>
+        </w:rPr>
+        <w:t xml:space="preserve">Figure 8.</w:t>
+      </w:r>
+      <w:r>
+        <w:t xml:space="preserve"> </w:t>
+      </w:r>
+      <w:r>
+        <w:t xml:space="preserve">PyRadiomics top-5 vs DVH volume for RANO (in-sample AUC 0.78 vs 0.71).</w:t>
+      </w:r>
+    </w:p>
+    <w:p>
+      <w:pPr>
+        <w:pStyle w:val="BodyText"/>
+      </w:pPr>
+      <w:r>
+        <w:rPr>
+          <w:b/>
+          <w:bCs/>
+        </w:rPr>
+        <w:t xml:space="preserve">Figure 8.</w:t>
+      </w:r>
+      <w:r>
+        <w:t xml:space="preserve"> </w:t>
+      </w:r>
+      <w:r>
+        <w:t xml:space="preserve">PyRadiomics top-5 vs DVH volume for RANO (in-sample AUC 0.78 vs 0.71).</w:t>
+      </w:r>
+    </w:p>
+    <w:p>
+      <w:pPr>
+        <w:pStyle w:val="BodyText"/>
+      </w:pPr>
+      <w:r>
+        <w:t xml:space="preserve">Using the author-provided PyRadiomics TSV (t1gd, GTV t0) [8,9,17], the top five radiomics features achieved</w:t>
+      </w:r>
+      <w:r>
+        <w:t xml:space="preserve"> </w:t>
+      </w:r>
+      <w:r>
+        <w:rPr>
+          <w:b/>
+          <w:bCs/>
+        </w:rPr>
+        <w:t xml:space="preserve">in-sample AUC≈0.78</w:t>
+      </w:r>
+      <w:r>
+        <w:t xml:space="preserve"> </w:t>
+      </w:r>
+      <w:r>
+        <w:t xml:space="preserve">for RANO non-PD vs</w:t>
+      </w:r>
+      <w:r>
+        <w:t xml:space="preserve"> </w:t>
+      </w:r>
+      <w:r>
+        <w:rPr>
+          <w:b/>
+          <w:bCs/>
+        </w:rPr>
+        <w:t xml:space="preserve">0.71</w:t>
+      </w:r>
+      <w:r>
+        <w:t xml:space="preserve"> </w:t>
+      </w:r>
+      <w:r>
+        <w:t xml:space="preserve">for DVH volume alone (n=137).</w:t>
+      </w:r>
+      <w:r>
+        <w:t xml:space="preserve"> </w:t>
+      </w:r>
+      <w:r>
+        <w:rPr>
+          <w:b/>
+          <w:bCs/>
+        </w:rPr>
+        <w:t xml:space="preserve">Nested 5-fold CV</w:t>
+      </w:r>
+      <w:r>
+        <w:t xml:space="preserve"> </w:t>
+      </w:r>
+      <w:r>
+        <w:t xml:space="preserve">(top-5 feature selection on train folds only) yielded</w:t>
+      </w:r>
+      <w:r>
+        <w:t xml:space="preserve"> </w:t>
+      </w:r>
+      <w:r>
+        <w:rPr>
+          <w:b/>
+          <w:bCs/>
+        </w:rPr>
+        <w:t xml:space="preserve">AUC≈0.74</w:t>
+      </w:r>
+      <w:r>
+        <w:t xml:space="preserve"> </w:t>
+      </w:r>
+      <w:r>
+        <w:t xml:space="preserve">for radiomics vs</w:t>
+      </w:r>
+      <w:r>
+        <w:t xml:space="preserve"> </w:t>
+      </w:r>
+      <w:r>
+        <w:rPr>
+          <w:b/>
+          <w:bCs/>
+        </w:rPr>
+        <w:t xml:space="preserve">0.70</w:t>
+      </w:r>
+      <w:r>
+        <w:t xml:space="preserve"> </w:t>
+      </w:r>
+      <w:r>
+        <w:t xml:space="preserve">for volume-only — optimism Δ≈0.04–0.07. Combined volume + top radiomics feature: in-sample AUC≈0.77. For OS median-split on the same patients, radiomics + clinical covariates reached AUC≈0.78 vs volume-only 0.59 [9,10] (see</w:t>
       </w:r>
       <w:r>
         <w:t xml:space="preserve"> </w:t>
@@ -1400,242 +2322,14 @@
         <w:rPr>
           <w:rStyle w:val="VerbatimChar"/>
         </w:rPr>
-        <w:t xml:space="preserve">size_t0_cm3</w:t>
-      </w:r>
-      <w:r>
-        <w:t xml:space="preserve"> </w:t>
-      </w:r>
-      <w:r>
-        <w:t xml:space="preserve">(Spearman ρ=1.00, n=141) [8]. t1 NIfTI mask validation was not performed locally; analyses used author-reported RANO volumes from the v3 TSV [8,9].</w:t>
-      </w:r>
-    </w:p>
-    <w:bookmarkEnd w:id="23"/>
-    <w:bookmarkStart w:id="24" w:name="rano-and-overall-survival"/>
-    <w:p>
-      <w:pPr>
-        <w:pStyle w:val="Heading3"/>
-      </w:pPr>
-      <w:r>
-        <w:t xml:space="preserve">3.6 RANO and overall survival</w:t>
-      </w:r>
-    </w:p>
-    <w:p>
-      <w:pPr>
-        <w:pStyle w:val="FirstParagraph"/>
-      </w:pPr>
-      <w:r>
-        <w:t xml:space="preserve">Cox model (n=137): RANO non-PD HR≈0.48 (p≈0.0009); EQD2 remained significant after adjustment (HR≈0.97, p≈0.009) [12,14].</w:t>
-      </w:r>
-    </w:p>
-    <w:bookmarkEnd w:id="24"/>
-    <w:bookmarkStart w:id="25" w:name="Xc8d476549152ed48c2fe29dd7b2e8a44632433d"/>
-    <w:p>
-      <w:pPr>
-        <w:pStyle w:val="Heading3"/>
-      </w:pPr>
-      <w:r>
-        <w:t xml:space="preserve">3.7 Pooled RANO models (volume + clinical + scheme)</w:t>
-      </w:r>
-    </w:p>
-    <w:p>
-      <w:pPr>
-        <w:pStyle w:val="FirstParagraph"/>
-      </w:pPr>
-      <w:r>
-        <w:t xml:space="preserve">On n=137 with RANO labels, EQD2 alone achieved AUC≈0.57.</w:t>
-      </w:r>
-      <w:r>
-        <w:t xml:space="preserve"> </w:t>
-      </w:r>
-      <w:r>
-        <w:rPr>
-          <w:b/>
-          <w:bCs/>
-        </w:rPr>
-        <w:t xml:space="preserve">GTV volume + age + WHO PS + scheme</w:t>
-      </w:r>
-      <w:r>
-        <w:t xml:space="preserve"> </w:t>
-      </w:r>
-      <w:r>
-        <w:t xml:space="preserve">improved discrimination to</w:t>
-      </w:r>
-      <w:r>
-        <w:t xml:space="preserve"> </w:t>
-      </w:r>
-      <w:r>
-        <w:rPr>
-          <w:b/>
-          <w:bCs/>
-        </w:rPr>
-        <w:t xml:space="preserve">AUC≈0.72</w:t>
-      </w:r>
-      <w:r>
-        <w:t xml:space="preserve">; adding a volume×scheme interaction yielded AUC≈0.72. LOOCV AUC for the pooled clinical model was</w:t>
-      </w:r>
-      <w:r>
-        <w:t xml:space="preserve"> </w:t>
-      </w:r>
-      <w:r>
-        <w:rPr>
-          <w:b/>
-          <w:bCs/>
-        </w:rPr>
-        <w:t xml:space="preserve">≈0.64</w:t>
-      </w:r>
-      <w:r>
-        <w:t xml:space="preserve"> </w:t>
-      </w:r>
-      <w:r>
-        <w:t xml:space="preserve">[18], indicating moderate generalisation within this single-centre cohort.</w:t>
-      </w:r>
-    </w:p>
-    <w:bookmarkEnd w:id="25"/>
-    <w:bookmarkStart w:id="26" w:name="loocv-in-the-hypofractionated-arm"/>
-    <w:p>
-      <w:pPr>
-        <w:pStyle w:val="Heading3"/>
-      </w:pPr>
-      <w:r>
-        <w:t xml:space="preserve">3.8 LOOCV in the hypofractionated arm</w:t>
-      </w:r>
-    </w:p>
-    <w:p>
-      <w:pPr>
-        <w:pStyle w:val="FirstParagraph"/>
-      </w:pPr>
-      <w:r>
-        <w:t xml:space="preserve">In-sample multivariable AUC in the 40 Gy arm was 0.90, but</w:t>
-      </w:r>
-      <w:r>
-        <w:t xml:space="preserve"> </w:t>
-      </w:r>
-      <w:r>
-        <w:rPr>
-          <w:b/>
-          <w:bCs/>
-        </w:rPr>
-        <w:t xml:space="preserve">LOOCV AUC was 0.74</w:t>
-      </w:r>
-      <w:r>
-        <w:t xml:space="preserve"> </w:t>
-      </w:r>
-      <w:r>
-        <w:t xml:space="preserve">(volume only) and 0.70 (volume + age + PS) [18], confirming signal beyond chance while reducing optimism bias relative to resubstitution [7].</w:t>
-      </w:r>
-    </w:p>
-    <w:bookmarkEnd w:id="26"/>
-    <w:bookmarkStart w:id="27" w:name="pyradiomics-vs-dvh-volume"/>
-    <w:p>
-      <w:pPr>
-        <w:pStyle w:val="Heading3"/>
-      </w:pPr>
-      <w:r>
-        <w:t xml:space="preserve">3.9 PyRadiomics vs DVH volume</w:t>
-      </w:r>
-    </w:p>
-    <w:p>
-      <w:pPr>
-        <w:pStyle w:val="FirstParagraph"/>
-      </w:pPr>
-      <w:r>
-        <w:t xml:space="preserve">Using the author-provided PyRadiomics TSV (t1gd, GTV t0) [8,9,17], the top five radiomics features achieved</w:t>
-      </w:r>
-      <w:r>
-        <w:t xml:space="preserve"> </w:t>
-      </w:r>
-      <w:r>
-        <w:rPr>
-          <w:b/>
-          <w:bCs/>
-        </w:rPr>
-        <w:t xml:space="preserve">in-sample AUC≈0.78</w:t>
-      </w:r>
-      <w:r>
-        <w:t xml:space="preserve"> </w:t>
-      </w:r>
-      <w:r>
-        <w:t xml:space="preserve">for RANO non-PD vs</w:t>
-      </w:r>
-      <w:r>
-        <w:t xml:space="preserve"> </w:t>
-      </w:r>
-      <w:r>
-        <w:rPr>
-          <w:b/>
-          <w:bCs/>
-        </w:rPr>
-        <w:t xml:space="preserve">0.71</w:t>
-      </w:r>
-      <w:r>
-        <w:t xml:space="preserve"> </w:t>
-      </w:r>
-      <w:r>
-        <w:t xml:space="preserve">for DVH volume alone (n=137).</w:t>
-      </w:r>
-      <w:r>
-        <w:t xml:space="preserve"> </w:t>
-      </w:r>
-      <w:r>
-        <w:rPr>
-          <w:b/>
-          <w:bCs/>
-        </w:rPr>
-        <w:t xml:space="preserve">Nested 5-fold CV</w:t>
-      </w:r>
-      <w:r>
-        <w:t xml:space="preserve"> </w:t>
-      </w:r>
-      <w:r>
-        <w:t xml:space="preserve">(top-5 feature selection on train folds only) yielded</w:t>
-      </w:r>
-      <w:r>
-        <w:t xml:space="preserve"> </w:t>
-      </w:r>
-      <w:r>
-        <w:rPr>
-          <w:b/>
-          <w:bCs/>
-        </w:rPr>
-        <w:t xml:space="preserve">AUC≈0.74</w:t>
-      </w:r>
-      <w:r>
-        <w:t xml:space="preserve"> </w:t>
-      </w:r>
-      <w:r>
-        <w:t xml:space="preserve">for radiomics vs</w:t>
-      </w:r>
-      <w:r>
-        <w:t xml:space="preserve"> </w:t>
-      </w:r>
-      <w:r>
-        <w:rPr>
-          <w:b/>
-          <w:bCs/>
-        </w:rPr>
-        <w:t xml:space="preserve">0.70</w:t>
-      </w:r>
-      <w:r>
-        <w:t xml:space="preserve"> </w:t>
-      </w:r>
-      <w:r>
-        <w:t xml:space="preserve">for volume-only — optimism Δ≈0.04–0.07. Combined volume + top radiomics feature: in-sample AUC≈0.77. For OS median-split on the same patients, radiomics + clinical covariates reached AUC≈0.78 vs volume-only 0.59 [9,10] (see</w:t>
-      </w:r>
-      <w:r>
-        <w:t xml:space="preserve"> </w:t>
-      </w:r>
-      <w:r>
-        <w:rPr>
-          <w:rStyle w:val="VerbatimChar"/>
-        </w:rPr>
         <w:t xml:space="preserve">figures/08_pyradiomics_nested_cv_auc.png</w:t>
       </w:r>
       <w:r>
         <w:t xml:space="preserve">).</w:t>
       </w:r>
     </w:p>
-    <w:bookmarkEnd w:id="27"/>
-    <w:bookmarkStart w:id="28" w:name="Xb29cc4e1dc8d03b27b794a7628700df92826e48"/>
+    <w:bookmarkEnd w:id="51"/>
+    <w:bookmarkStart w:id="52" w:name="Xb29cc4e1dc8d03b27b794a7628700df92826e48"/>
     <w:p>
       <w:pPr>
         <w:pStyle w:val="Heading3"/>
@@ -1719,9 +2413,9 @@
         </w:pict>
       </w:r>
     </w:p>
-    <w:bookmarkEnd w:id="28"/>
-    <w:bookmarkEnd w:id="29"/>
-    <w:bookmarkStart w:id="36" w:name="discussion"/>
+    <w:bookmarkEnd w:id="52"/>
+    <w:bookmarkEnd w:id="53"/>
+    <w:bookmarkStart w:id="60" w:name="discussion"/>
     <w:p>
       <w:pPr>
         <w:pStyle w:val="Heading2"/>
@@ -1730,7 +2424,7 @@
         <w:t xml:space="preserve">4. Discussion</w:t>
       </w:r>
     </w:p>
-    <w:bookmarkStart w:id="30" w:name="why-pooled-dosetcp-fails-here"/>
+    <w:bookmarkStart w:id="54" w:name="why-pooled-dosetcp-fails-here"/>
     <w:p>
       <w:pPr>
         <w:pStyle w:val="Heading3"/>
@@ -1800,8 +2494,8 @@
         <w:t xml:space="preserve">[4,7]. This aligns with Ohri et al.'s emphasis on adequate dose heterogeneity and appropriate endpoints for TCP validation [7].</w:t>
       </w:r>
     </w:p>
-    <w:bookmarkEnd w:id="30"/>
-    <w:bookmarkStart w:id="31" w:name="X033efa3e81b5c30ff239cd83b5af0564d93ff88"/>
+    <w:bookmarkEnd w:id="54"/>
+    <w:bookmarkStart w:id="55" w:name="X033efa3e81b5c30ff239cd83b5af0564d93ff88"/>
     <w:p>
       <w:pPr>
         <w:pStyle w:val="Heading3"/>
@@ -1871,8 +2565,8 @@
         <w:t xml:space="preserve">is the more defensible estimate [18]. The 60 Gy arm shows a weaker but directionally consistent association (Spearman p≈0.019, Poisson AUC≈0.66, n=96).</w:t>
       </w:r>
     </w:p>
-    <w:bookmarkEnd w:id="31"/>
-    <w:bookmarkStart w:id="32" w:name="X355b3a6bfbd0ce99cf6cab29011853cdf08ac5e"/>
+    <w:bookmarkEnd w:id="55"/>
+    <w:bookmarkStart w:id="56" w:name="X355b3a6bfbd0ce99cf6cab29011853cdf08ac5e"/>
     <w:p>
       <w:pPr>
         <w:pStyle w:val="Heading3"/>
@@ -1913,8 +2607,8 @@
         <w:t xml:space="preserve">Feature standardisation follows IBSI recommendations [17]; we did not re-extract radiomics locally, ensuring parity with the published TCIA feature table [8,9].</w:t>
       </w:r>
     </w:p>
-    <w:bookmarkEnd w:id="32"/>
-    <w:bookmarkStart w:id="33" w:name="clinical-prognostic-context"/>
+    <w:bookmarkEnd w:id="56"/>
+    <w:bookmarkStart w:id="57" w:name="clinical-prognostic-context"/>
     <w:p>
       <w:pPr>
         <w:pStyle w:val="Heading3"/>
@@ -1931,8 +2625,8 @@
         <w:t xml:space="preserve">Independent of TCP framing, CFB-GBM confirms known prognostic factors: 60 vs 40 Gy OS separation (p≈10⁻⁷) [2,15], WHO PS gradient [2], and RANO non-PD as an OS predictor (Cox HR≈0.48) [12,14]. These descriptive findings support data quality but are not novel; they anchor the dosimetry/RANO feasibility narrative.</w:t>
       </w:r>
     </w:p>
-    <w:bookmarkEnd w:id="33"/>
-    <w:bookmarkStart w:id="34" w:name="implications-for-open-data-tcp-research"/>
+    <w:bookmarkEnd w:id="57"/>
+    <w:bookmarkStart w:id="58" w:name="implications-for-open-data-tcp-research"/>
     <w:p>
       <w:pPr>
         <w:pStyle w:val="Heading3"/>
@@ -1949,8 +2643,8 @@
         <w:t xml:space="preserve">We propose a practical checklist for future open-cohort TCP studies [7]: (1) report within-arm GTV Dmean IQR before fitting TCP; (2) prefer imaging response or LC over OS [12,13]; (3) adjust for fractionation and age [15]; (4) report LOOCV or nested CV alongside in-sample AUC [18]; (5) compare against author-provided radiomics baselines when available [8,9,17].</w:t>
       </w:r>
     </w:p>
-    <w:bookmarkEnd w:id="34"/>
-    <w:bookmarkStart w:id="35" w:name="limitations"/>
+    <w:bookmarkEnd w:id="58"/>
+    <w:bookmarkStart w:id="59" w:name="limitations"/>
     <w:p>
       <w:pPr>
         <w:pStyle w:val="Heading3"/>
@@ -2053,9 +2747,9 @@
         </w:pict>
       </w:r>
     </w:p>
-    <w:bookmarkEnd w:id="35"/>
-    <w:bookmarkEnd w:id="36"/>
-    <w:bookmarkStart w:id="37" w:name="conclusion"/>
+    <w:bookmarkEnd w:id="59"/>
+    <w:bookmarkEnd w:id="60"/>
+    <w:bookmarkStart w:id="61" w:name="conclusion"/>
     <w:p>
       <w:pPr>
         <w:pStyle w:val="Heading2"/>
@@ -2171,8 +2865,8 @@
         </w:pict>
       </w:r>
     </w:p>
-    <w:bookmarkEnd w:id="37"/>
-    <w:bookmarkStart w:id="38" w:name="references"/>
+    <w:bookmarkEnd w:id="61"/>
+    <w:bookmarkStart w:id="62" w:name="references"/>
     <w:p>
       <w:pPr>
         <w:pStyle w:val="Heading2"/>
@@ -2620,621 +3314,8 @@
         </w:pict>
       </w:r>
     </w:p>
-    <w:bookmarkEnd w:id="38"/>
-    <w:bookmarkStart w:id="39" w:name="figure-list-from-repository"/>
-    <w:p>
-      <w:pPr>
-        <w:pStyle w:val="Heading2"/>
-      </w:pPr>
-      <w:r>
-        <w:t xml:space="preserve">Figure list (from repository)</w:t>
-      </w:r>
-    </w:p>
-    <w:tbl>
-      <w:tblPr>
-        <w:tblStyle w:val="Table"/>
-        <w:tblW w:type="pct" w:w="5000"/>
-        <w:tblLayout w:type="fixed"/>
-        <w:tblLook w:firstRow="1" w:lastRow="0" w:firstColumn="0" w:lastColumn="0" w:noHBand="0" w:noVBand="0" w:val="0020"/>
-      </w:tblPr>
-      <w:tblGrid>
-        <w:gridCol w:w="3727"/>
-        <w:gridCol w:w="4192"/>
-      </w:tblGrid>
-      <w:tr>
-        <w:trPr>
-          <w:tblHeader w:val="on"/>
-        </w:trPr>
-        <w:tc>
-          <w:tcPr/>
-          <w:p>
-            <w:pPr>
-              <w:pStyle w:val="Compact"/>
-            </w:pPr>
-            <w:r>
-              <w:t xml:space="preserve">Figure</w:t>
-            </w:r>
-          </w:p>
-        </w:tc>
-        <w:tc>
-          <w:tcPr/>
-          <w:p>
-            <w:pPr>
-              <w:pStyle w:val="Compact"/>
-            </w:pPr>
-            <w:r>
-              <w:t xml:space="preserve">Content</w:t>
-            </w:r>
-          </w:p>
-        </w:tc>
-      </w:tr>
-      <w:tr>
-        <w:tc>
-          <w:tcPr/>
-          <w:p>
-            <w:pPr>
-              <w:pStyle w:val="Compact"/>
-            </w:pPr>
-            <w:r>
-              <w:t xml:space="preserve">Fig 1</w:t>
-            </w:r>
-          </w:p>
-        </w:tc>
-        <w:tc>
-          <w:tcPr/>
-          <w:p>
-            <w:pPr>
-              <w:pStyle w:val="Compact"/>
-            </w:pPr>
-            <w:r>
-              <w:t xml:space="preserve">Cohort / fractionation KM (</w:t>
-            </w:r>
-            <w:r>
-              <w:rPr>
-                <w:rStyle w:val="VerbatimChar"/>
-              </w:rPr>
-              <w:t xml:space="preserve">04_clinical_prognosis.png</w:t>
-            </w:r>
-            <w:r>
-              <w:t xml:space="preserve">)</w:t>
-            </w:r>
-          </w:p>
-        </w:tc>
-      </w:tr>
-      <w:tr>
-        <w:tc>
-          <w:tcPr/>
-          <w:p>
-            <w:pPr>
-              <w:pStyle w:val="Compact"/>
-            </w:pPr>
-            <w:r>
-              <w:t xml:space="preserve">Fig 2</w:t>
-            </w:r>
-          </w:p>
-        </w:tc>
-        <w:tc>
-          <w:tcPr/>
-          <w:p>
-            <w:pPr>
-              <w:pStyle w:val="Compact"/>
-            </w:pPr>
-            <w:r>
-              <w:t xml:space="preserve">Pooled TCP curves OS proxy (</w:t>
-            </w:r>
-            <w:r>
-              <w:rPr>
-                <w:rStyle w:val="VerbatimChar"/>
-              </w:rPr>
-              <w:t xml:space="preserve">03_tcp_curves_os_proxy.png</w:t>
-            </w:r>
-            <w:r>
-              <w:t xml:space="preserve">)</w:t>
-            </w:r>
-          </w:p>
-        </w:tc>
-      </w:tr>
-      <w:tr>
-        <w:tc>
-          <w:tcPr/>
-          <w:p>
-            <w:pPr>
-              <w:pStyle w:val="Compact"/>
-            </w:pPr>
-            <w:r>
-              <w:t xml:space="preserve">Fig 3</w:t>
-            </w:r>
-          </w:p>
-        </w:tc>
-        <w:tc>
-          <w:tcPr/>
-          <w:p>
-            <w:pPr>
-              <w:pStyle w:val="Compact"/>
-            </w:pPr>
-            <w:r>
-              <w:t xml:space="preserve">OS vs RANO AUC comparison (</w:t>
-            </w:r>
-            <w:r>
-              <w:rPr>
-                <w:rStyle w:val="VerbatimChar"/>
-              </w:rPr>
-              <w:t xml:space="preserve">05_rano_vs_os_tcp_auc.png</w:t>
-            </w:r>
-            <w:r>
-              <w:t xml:space="preserve">)</w:t>
-            </w:r>
-          </w:p>
-        </w:tc>
-      </w:tr>
-      <w:tr>
-        <w:tc>
-          <w:tcPr/>
-          <w:p>
-            <w:pPr>
-              <w:pStyle w:val="Compact"/>
-            </w:pPr>
-            <w:r>
-              <w:t xml:space="preserve">Fig 4</w:t>
-            </w:r>
-          </w:p>
-        </w:tc>
-        <w:tc>
-          <w:tcPr/>
-          <w:p>
-            <w:pPr>
-              <w:pStyle w:val="Compact"/>
-            </w:pPr>
-            <w:r>
-              <w:t xml:space="preserve">Within-arm DVH→RANO (</w:t>
-            </w:r>
-            <w:r>
-              <w:rPr>
-                <w:rStyle w:val="VerbatimChar"/>
-              </w:rPr>
-              <w:t xml:space="preserve">06_within_arm_rano_tcp.png</w:t>
-            </w:r>
-            <w:r>
-              <w:t xml:space="preserve">)</w:t>
-            </w:r>
-          </w:p>
-        </w:tc>
-      </w:tr>
-      <w:tr>
-        <w:tc>
-          <w:tcPr/>
-          <w:p>
-            <w:pPr>
-              <w:pStyle w:val="Compact"/>
-            </w:pPr>
-            <w:r>
-              <w:t xml:space="preserve">Fig 5</w:t>
-            </w:r>
-          </w:p>
-        </w:tc>
-        <w:tc>
-          <w:tcPr/>
-          <w:p>
-            <w:pPr>
-              <w:pStyle w:val="Compact"/>
-            </w:pPr>
-            <w:r>
-              <w:t xml:space="preserve">Multivariable ROC 40 Gy (</w:t>
-            </w:r>
-            <w:r>
-              <w:rPr>
-                <w:rStyle w:val="VerbatimChar"/>
-              </w:rPr>
-              <w:t xml:space="preserve">07_rano_logistic_roc_40gy.png</w:t>
-            </w:r>
-            <w:r>
-              <w:t xml:space="preserve">)</w:t>
-            </w:r>
-          </w:p>
-        </w:tc>
-      </w:tr>
-      <w:tr>
-        <w:tc>
-          <w:tcPr/>
-          <w:p>
-            <w:pPr>
-              <w:pStyle w:val="Compact"/>
-            </w:pPr>
-            <w:r>
-              <w:t xml:space="preserve">Fig 6</w:t>
-            </w:r>
-          </w:p>
-        </w:tc>
-        <w:tc>
-          <w:tcPr/>
-          <w:p>
-            <w:pPr>
-              <w:pStyle w:val="Compact"/>
-            </w:pPr>
-            <w:r>
-              <w:t xml:space="preserve">Volume validation scatter (</w:t>
-            </w:r>
-            <w:r>
-              <w:rPr>
-                <w:rStyle w:val="VerbatimChar"/>
-              </w:rPr>
-              <w:t xml:space="preserve">07_rano_volume_validation_40gy.png</w:t>
-            </w:r>
-            <w:r>
-              <w:t xml:space="preserve">)</w:t>
-            </w:r>
-          </w:p>
-        </w:tc>
-      </w:tr>
-      <w:tr>
-        <w:tc>
-          <w:tcPr/>
-          <w:p>
-            <w:pPr>
-              <w:pStyle w:val="Compact"/>
-            </w:pPr>
-            <w:r>
-              <w:t xml:space="preserve">Fig 7</w:t>
-            </w:r>
-          </w:p>
-        </w:tc>
-        <w:tc>
-          <w:tcPr/>
-          <w:p>
-            <w:pPr>
-              <w:pStyle w:val="Compact"/>
-            </w:pPr>
-            <w:r>
-              <w:t xml:space="preserve">Pooled RANO ROC (</w:t>
-            </w:r>
-            <w:r>
-              <w:rPr>
-                <w:rStyle w:val="VerbatimChar"/>
-              </w:rPr>
-              <w:t xml:space="preserve">08_pooled_rano_roc.png</w:t>
-            </w:r>
-            <w:r>
-              <w:t xml:space="preserve">)</w:t>
-            </w:r>
-          </w:p>
-        </w:tc>
-      </w:tr>
-      <w:tr>
-        <w:tc>
-          <w:tcPr/>
-          <w:p>
-            <w:pPr>
-              <w:pStyle w:val="Compact"/>
-            </w:pPr>
-            <w:r>
-              <w:t xml:space="preserve">Fig 8</w:t>
-            </w:r>
-          </w:p>
-        </w:tc>
-        <w:tc>
-          <w:tcPr/>
-          <w:p>
-            <w:pPr>
-              <w:pStyle w:val="Compact"/>
-            </w:pPr>
-            <w:r>
-              <w:t xml:space="preserve">PyRadiomics vs volume AUC (</w:t>
-            </w:r>
-            <w:r>
-              <w:rPr>
-                <w:rStyle w:val="VerbatimChar"/>
-              </w:rPr>
-              <w:t xml:space="preserve">08_pyradiomics_vs_volume_auc.png</w:t>
-            </w:r>
-            <w:r>
-              <w:t xml:space="preserve">)</w:t>
-            </w:r>
-          </w:p>
-        </w:tc>
-      </w:tr>
-      <w:tr>
-        <w:tc>
-          <w:tcPr/>
-          <w:p>
-            <w:pPr>
-              <w:pStyle w:val="Compact"/>
-            </w:pPr>
-            <w:r>
-              <w:t xml:space="preserve">Fig 9</w:t>
-            </w:r>
-          </w:p>
-        </w:tc>
-        <w:tc>
-          <w:tcPr/>
-          <w:p>
-            <w:pPr>
-              <w:pStyle w:val="Compact"/>
-            </w:pPr>
-            <w:r>
-              <w:t xml:space="preserve">PyRadiomics nested CV (</w:t>
-            </w:r>
-            <w:r>
-              <w:rPr>
-                <w:rStyle w:val="VerbatimChar"/>
-              </w:rPr>
-              <w:t xml:space="preserve">08_pyradiomics_nested_cv_auc.png</w:t>
-            </w:r>
-            <w:r>
-              <w:t xml:space="preserve">)</w:t>
-            </w:r>
-          </w:p>
-        </w:tc>
-      </w:tr>
-    </w:tbl>
-    <w:p>
-      <w:r>
-        <w:pict>
-          <v:rect style="width:0;height:1.5pt" o:hralign="center" o:hrstd="t" o:hr="t"/>
-        </w:pict>
-      </w:r>
-    </w:p>
-    <w:bookmarkEnd w:id="39"/>
-    <w:bookmarkStart w:id="40" w:name="presentation-outline-15-slides"/>
-    <w:p>
-      <w:pPr>
-        <w:pStyle w:val="Heading2"/>
-      </w:pPr>
-      <w:r>
-        <w:t xml:space="preserve">Presentation outline (15 slides)</w:t>
-      </w:r>
-    </w:p>
-    <w:p>
-      <w:pPr>
-        <w:pStyle w:val="Compact"/>
-        <w:numPr>
-          <w:ilvl w:val="0"/>
-          <w:numId w:val="1004"/>
-        </w:numPr>
-      </w:pPr>
-      <w:r>
-        <w:t xml:space="preserve">Title &amp; motivation (TCP + open data) [4,8]</w:t>
-      </w:r>
-    </w:p>
-    <w:p>
-      <w:pPr>
-        <w:pStyle w:val="Compact"/>
-        <w:numPr>
-          <w:ilvl w:val="0"/>
-          <w:numId w:val="1004"/>
-        </w:numPr>
-      </w:pPr>
-      <w:r>
-        <w:t xml:space="preserve">CFB-GBM overview (TCIA v3, RANO) [8–10]</w:t>
-      </w:r>
-    </w:p>
-    <w:p>
-      <w:pPr>
-        <w:pStyle w:val="Compact"/>
-        <w:numPr>
-          <w:ilvl w:val="0"/>
-          <w:numId w:val="1004"/>
-        </w:numPr>
-      </w:pPr>
-      <w:r>
-        <w:t xml:space="preserve">Cohort flowchart (264→190)</w:t>
-      </w:r>
-    </w:p>
-    <w:p>
-      <w:pPr>
-        <w:pStyle w:val="Compact"/>
-        <w:numPr>
-          <w:ilvl w:val="0"/>
-          <w:numId w:val="1004"/>
-        </w:numPr>
-      </w:pPr>
-      <w:r>
-        <w:t xml:space="preserve">Methods pipeline diagram</w:t>
-      </w:r>
-    </w:p>
-    <w:p>
-      <w:pPr>
-        <w:pStyle w:val="Compact"/>
-        <w:numPr>
-          <w:ilvl w:val="0"/>
-          <w:numId w:val="1004"/>
-        </w:numPr>
-      </w:pPr>
-      <w:r>
-        <w:t xml:space="preserve">TCP model equations (1 slide) [4–6,11]</w:t>
-      </w:r>
-    </w:p>
-    <w:p>
-      <w:pPr>
-        <w:pStyle w:val="Compact"/>
-        <w:numPr>
-          <w:ilvl w:val="0"/>
-          <w:numId w:val="1004"/>
-        </w:numPr>
-      </w:pPr>
-      <w:r>
-        <w:t xml:space="preserve">Clinical results: OS by scheme + WHO PS [2,15]</w:t>
-      </w:r>
-    </w:p>
-    <w:p>
-      <w:pPr>
-        <w:pStyle w:val="Compact"/>
-        <w:numPr>
-          <w:ilvl w:val="0"/>
-          <w:numId w:val="1004"/>
-        </w:numPr>
-      </w:pPr>
-      <w:r>
-        <w:t xml:space="preserve">Pooled TCP OS proxy (AUC 0.68) + caveat [7]</w:t>
-      </w:r>
-    </w:p>
-    <w:p>
-      <w:pPr>
-        <w:pStyle w:val="Compact"/>
-        <w:numPr>
-          <w:ilvl w:val="0"/>
-          <w:numId w:val="1004"/>
-        </w:numPr>
-      </w:pPr>
-      <w:r>
-        <w:t xml:space="preserve">RANO pooled failure (AUC 0.43) — confounding [12,15]</w:t>
-      </w:r>
-    </w:p>
-    <w:p>
-      <w:pPr>
-        <w:pStyle w:val="Compact"/>
-        <w:numPr>
-          <w:ilvl w:val="0"/>
-          <w:numId w:val="1004"/>
-        </w:numPr>
-      </w:pPr>
-      <w:r>
-        <w:t xml:space="preserve">Pooled volume+scheme models (AUC 0.72) + LOOCV 0.64</w:t>
-      </w:r>
-    </w:p>
-    <w:p>
-      <w:pPr>
-        <w:pStyle w:val="Compact"/>
-        <w:numPr>
-          <w:ilvl w:val="0"/>
-          <w:numId w:val="1004"/>
-        </w:numPr>
-      </w:pPr>
-      <w:r>
-        <w:t xml:space="preserve">Within-arm 40 Gy: volume→RANO + LOOCV 0.74 [16]</w:t>
-      </w:r>
-    </w:p>
-    <w:p>
-      <w:pPr>
-        <w:pStyle w:val="Compact"/>
-        <w:numPr>
-          <w:ilvl w:val="0"/>
-          <w:numId w:val="1004"/>
-        </w:numPr>
-      </w:pPr>
-      <w:r>
-        <w:t xml:space="preserve">PyRadiomics vs DVH volume (AUC 0.78 vs 0.71) [9,17]</w:t>
-      </w:r>
-    </w:p>
-    <w:p>
-      <w:pPr>
-        <w:pStyle w:val="Compact"/>
-        <w:numPr>
-          <w:ilvl w:val="0"/>
-          <w:numId w:val="1004"/>
-        </w:numPr>
-      </w:pPr>
-      <w:r>
-        <w:t xml:space="preserve">Cox: RANO predicts OS [14]</w:t>
-      </w:r>
-    </w:p>
-    <w:p>
-      <w:pPr>
-        <w:pStyle w:val="Compact"/>
-        <w:numPr>
-          <w:ilvl w:val="0"/>
-          <w:numId w:val="1004"/>
-        </w:numPr>
-      </w:pPr>
-      <w:r>
-        <w:t xml:space="preserve">Limitations (honest)</w:t>
-      </w:r>
-    </w:p>
-    <w:p>
-      <w:pPr>
-        <w:pStyle w:val="Compact"/>
-        <w:numPr>
-          <w:ilvl w:val="0"/>
-          <w:numId w:val="1004"/>
-        </w:numPr>
-      </w:pPr>
-      <w:r>
-        <w:t xml:space="preserve">Comparison to Moreau radiomics + checklist [9,10]</w:t>
-      </w:r>
-    </w:p>
-    <w:p>
-      <w:pPr>
-        <w:pStyle w:val="Compact"/>
-        <w:numPr>
-          <w:ilvl w:val="0"/>
-          <w:numId w:val="1004"/>
-        </w:numPr>
-      </w:pPr>
-      <w:r>
-        <w:t xml:space="preserve">Conclusions + DOI [8]</w:t>
-      </w:r>
-    </w:p>
-    <w:p>
-      <w:r>
-        <w:pict>
-          <v:rect style="width:0;height:1.5pt" o:hralign="center" o:hrstd="t" o:hr="t"/>
-        </w:pict>
-      </w:r>
-    </w:p>
-    <w:p>
-      <w:pPr>
-        <w:pStyle w:val="FirstParagraph"/>
-      </w:pPr>
-      <w:r>
-        <w:rPr>
-          <w:i/>
-          <w:iCs/>
-        </w:rPr>
-        <w:t xml:space="preserve">Numbers verified against</w:t>
-      </w:r>
-      <w:r>
-        <w:rPr>
-          <w:i/>
-          <w:iCs/>
-        </w:rPr>
-        <w:t xml:space="preserve"> </w:t>
-      </w:r>
-      <w:r>
-        <w:rPr>
-          <w:rStyle w:val="VerbatimChar"/>
-          <w:i/>
-          <w:iCs/>
-        </w:rPr>
-        <w:t xml:space="preserve">reports/metrics/</w:t>
-      </w:r>
-      <w:r>
-        <w:rPr>
-          <w:i/>
-          <w:iCs/>
-        </w:rPr>
-        <w:t xml:space="preserve"> </w:t>
-      </w:r>
-      <w:r>
-        <w:rPr>
-          <w:i/>
-          <w:iCs/>
-        </w:rPr>
-        <w:t xml:space="preserve">on 2026-06-28. Reference DOIs verified in</w:t>
-      </w:r>
-      <w:r>
-        <w:rPr>
-          <w:i/>
-          <w:iCs/>
-        </w:rPr>
-        <w:t xml:space="preserve"> </w:t>
-      </w:r>
-      <w:r>
-        <w:rPr>
-          <w:rStyle w:val="VerbatimChar"/>
-          <w:i/>
-          <w:iCs/>
-        </w:rPr>
-        <w:t xml:space="preserve">reports/literature_table.csv</w:t>
-      </w:r>
-      <w:r>
-        <w:rPr>
-          <w:i/>
-          <w:iCs/>
-        </w:rPr>
-        <w:t xml:space="preserve">.</w:t>
-      </w:r>
-    </w:p>
-    <w:bookmarkEnd w:id="40"/>
-    <w:bookmarkEnd w:id="41"/>
+    <w:bookmarkEnd w:id="62"/>
+    <w:bookmarkEnd w:id="63"/>
     <w:sectPr>
       <w:footnotePr>
         <w:numRestart w:val="eachSect"/>
@@ -3543,36 +3624,6 @@
     <w:abstractNumId w:val="991"/>
   </w:num>
   <w:num w:numId="1003">
-    <w:abstractNumId w:val="99411"/>
-    <w:lvlOverride w:ilvl="0">
-      <w:startOverride w:val="1"/>
-    </w:lvlOverride>
-    <w:lvlOverride w:ilvl="1">
-      <w:startOverride w:val="1"/>
-    </w:lvlOverride>
-    <w:lvlOverride w:ilvl="2">
-      <w:startOverride w:val="1"/>
-    </w:lvlOverride>
-    <w:lvlOverride w:ilvl="3">
-      <w:startOverride w:val="1"/>
-    </w:lvlOverride>
-    <w:lvlOverride w:ilvl="4">
-      <w:startOverride w:val="1"/>
-    </w:lvlOverride>
-    <w:lvlOverride w:ilvl="5">
-      <w:startOverride w:val="1"/>
-    </w:lvlOverride>
-    <w:lvlOverride w:ilvl="6">
-      <w:startOverride w:val="1"/>
-    </w:lvlOverride>
-    <w:lvlOverride w:ilvl="7">
-      <w:startOverride w:val="1"/>
-    </w:lvlOverride>
-    <w:lvlOverride w:ilvl="8">
-      <w:startOverride w:val="1"/>
-    </w:lvlOverride>
-  </w:num>
-  <w:num w:numId="1004">
     <w:abstractNumId w:val="99411"/>
     <w:lvlOverride w:ilvl="0">
       <w:startOverride w:val="1"/>

</xml_diff>